<commit_message>
Aylo v3: Kfir's summary and bullets, one page; PO, QA/UAT bullets in library; rules logged
Co-Authored-By: Claude Opus 5.5 <noreply@anthropic.com>
Claude-Session: https://claude.ai/code/session_014V4QAtPACXfh5gMq6x31Wz
</commit_message>
<xml_diff>
--- a/jobs/2026-09-30 Aylo PaymentServices/Kfir_Braunstein_PM_Aylo.docx
+++ b/jobs/2026-09-30 Aylo PaymentServices/Kfir_Braunstein_PM_Aylo.docx
@@ -72,7 +72,7 @@
           <w:color w:val="1a1a1a"/>
           <w:rtl w:val="0"/>
         </w:rPr>
-        <w:t>Product Manager with 5 years of experience in payments, payouts, and platform integrations in B2B2C SaaS. Built subscription and multi-entry payment workflows, client payouts on Stripe Connect, and an integration mapping tool for client systems, driving $100K+ in incremental ARR and 18% QoQ usage growth. As the company's first and only PM, ran Scrum end to end, from sprint planning and backlog grooming to user stories and acceptance criteria.</w:t>
+        <w:t>Product Manager with 5 years of experience in product and customer success roles at a B2B2C SaaS company serving 100+ municipalities and organizations across North America and Europe, engaging 12M+ residents. Acted as Product Owner for Engineering and Design, setting sprint goals and writing user stories, use cases, and acceptance criteria, and owned the company's payment products built on Stripe.</w:t>
       </w:r>
       <w:r>
         <w:rPr>
@@ -216,7 +216,7 @@
           <w:vertAlign w:val="baseline"/>
           <w:rtl w:val="0"/>
         </w:rPr>
-        <w:t>Led a new subscription and multi-entry payment product from discovery to launch, turning messy client and Sales requests into clear requirements and shipping with Engineering to generate $100K+ in incremental ARR.</w:t>
+        <w:t>Owned the payment solution end to end, working with each client's finance team to set up how their revenue was collected and paid out to them through Stripe Connect, and gathering payment reporting requirements from our own finance team.</w:t>
       </w:r>
       <w:r>
         <w:rPr>
@@ -262,7 +262,7 @@
           <w:vertAlign w:val="baseline"/>
           <w:rtl w:val="0"/>
         </w:rPr>
-        <w:t>Owned the payment solution end to end, working with each client's finance team to set up how their revenue was collected and paid out to them through Stripe Connect.</w:t>
+        <w:t>Investigated failed webhooks, sync gaps, and reconciliation errors between Stripe and our platform by querying the database with SQL and checking admin panels and activity logs, tracing each issue to its cause and defining the fix with Engineering.</w:t>
       </w:r>
       <w:r>
         <w:rPr>
@@ -308,7 +308,7 @@
           <w:vertAlign w:val="baseline"/>
           <w:rtl w:val="0"/>
         </w:rPr>
-        <w:t>Investigated failed webhooks, sync gaps, and reconciliation errors between Stripe and our platform by querying the database with SQL and checking admin panels and activity logs, tracing each issue to its cause and defining the fix with Engineering.</w:t>
+        <w:t>Led a new subscription and multi-entry payment product from discovery to launch, turning messy client and Sales requests into clear requirements and shipping with Engineering to generate $100K+ in incremental ARR.</w:t>
       </w:r>
       <w:r>
         <w:rPr>
@@ -400,7 +400,7 @@
           <w:vertAlign w:val="baseline"/>
           <w:rtl w:val="0"/>
         </w:rPr>
-        <w:t>Tested new features hands-on in staging and logged bugs for Engineering in Jam.dev before release. Then shipped in stages through EU and US production, checking behavioral data before full rollout.</w:t>
+        <w:t>Acted as Product Owner for Engineering and Design teams across time zones, setting sprint goals from leadership's priorities and running sprint planning, backlog grooming, and retros.</w:t>
       </w:r>
       <w:r>
         <w:rPr>
@@ -446,7 +446,7 @@
           <w:vertAlign w:val="baseline"/>
           <w:rtl w:val="0"/>
         </w:rPr>
-        <w:t>Built an internal integration mapping tool to replace a manual spreadsheet process, supporting two-way data sync with client systems, validating third-party provider APIs in Postman, and cutting engineering integration effort from days to hours.</w:t>
+        <w:t>Wrote test cases and tested new features hands-on in staging, logging bugs for Engineering in Jam.dev and running UAT with clients before shipping in stages through EU and US production.</w:t>
       </w:r>
       <w:r>
         <w:rPr>
@@ -492,7 +492,7 @@
           <w:vertAlign w:val="baseline"/>
           <w:rtl w:val="0"/>
         </w:rPr>
-        <w:t>Served as the main technical contact between municipal IT teams and Engineering, and owned API documentation and integration support for client developers.</w:t>
+        <w:t>Built an internal integration mapping tool to replace a manual spreadsheet process, supporting two-way data sync with client systems, validating third-party provider APIs in Postman, and cutting engineering integration effort from days to hours.</w:t>
       </w:r>
       <w:r>
         <w:rPr>
@@ -538,7 +538,7 @@
           <w:vertAlign w:val="baseline"/>
           <w:rtl w:val="0"/>
         </w:rPr>
-        <w:t>Defined an internal engagement scoring system that Engineering built, then combined its usage data with CS syncs and support tickets to set success metrics and roadmap priorities, driving 18% QoQ usage growth.</w:t>
+        <w:t>Served as the main technical contact between municipal IT teams and Engineering, owning API documentation for client developers and turning client feature requests into scoped requirements.</w:t>
       </w:r>
       <w:r>
         <w:rPr>
@@ -960,7 +960,7 @@
           <w:color w:val="1a1a1a"/>
           <w:rtl w:val="0"/>
         </w:rPr>
-        <w:t>Agile, Scrum, Sprint Planning, Backlog Management, Prioritization, User Stories, Acceptance Criteria</w:t>
+        <w:t>Product Owner, Scrum, Sprint Goals, User Stories, Use Cases, Acceptance Criteria, Business Cases</w:t>
       </w:r>
       <w:r>
         <w:rPr>
@@ -1018,7 +1018,7 @@
           <w:color w:val="1a1a1a"/>
           <w:rtl w:val="0"/>
         </w:rPr>
-        <w:t xml:space="preserve">QA Testing, Staging Validation, Bug Tracking, Staged Releases, Release Notes, Documentation</w:t>
+        <w:t xml:space="preserve">QA Testing, Test Cases, UAT, Staging Validation, Bug Tracking, Staged Releases, Release Notes</w:t>
       </w:r>
       <w:r>
         <w:rPr>
@@ -1047,7 +1047,7 @@
           <w:color w:val="1a1a1a"/>
           <w:rtl w:val="0"/>
         </w:rPr>
-        <w:t xml:space="preserve">REST APIs, Postman, Data Modeling, Third-party Integrations, Technical Documentation, SSO/OAuth2</w:t>
+        <w:t xml:space="preserve">REST APIs, Postman, Data Modeling, Third-party Integrations, Technical Documentation</w:t>
       </w:r>
       <w:r>
         <w:rPr>
@@ -1171,7 +1171,7 @@
           <w:color w:val="555555"/>
           <w:rtl w:val="0"/>
         </w:rPr>
-        <w:t xml:space="preserve">B.Arch. — Bachelor of Architecture  |  2015 - 2019</w:t>
+        <w:t xml:space="preserve">B.Arch. - Bachelor of Architecture  |  2015 - 2019</w:t>
       </w:r>
       <w:r>
         <w:rPr>

</xml_diff>